<commit_message>
Correct Color Space gamut slider documentation
The Cyan–Red and Magenta–Green sliders apply to the entire selected
color space globally, not per individual primary/secondary color.
Previous description of 6 axes × 2 sliders = 12 adjustments was wrong;
correct count is 2 sliders total. Verified from OSD screenshot.

Updated: CLAUDE.md, generate_manual.py, VPL-VW385ES_Calibration_Controls.docx

Co-Authored-By: Claude Sonnet 4.6 <noreply@anthropic.com>
</commit_message>
<xml_diff>
--- a/Resources/VPL-VW385ES_Calibration_Controls.docx
+++ b/Resources/VPL-VW385ES_Calibration_Controls.docx
@@ -5430,7 +5430,7 @@
           <w:color w:val="444444"/>
           <w:sz w:val="20"/>
         </w:rPr>
-        <w:t>Custom Color Space — Chromaticity Sub-Menu</w:t>
+        <w:t>Color Space Gamut Adjustment</w:t>
       </w:r>
     </w:p>
     <w:p>
@@ -5444,7 +5444,7 @@
           <w:color w:val="444444"/>
           <w:sz w:val="20"/>
         </w:rPr>
-        <w:t>When Custom is selected, a Color Select control cycles through six colour axes. Each axis exposes two sliders that shift the selected primary or secondary colour along opponent-colour directions in the CIE chromaticity diagram.</w:t>
+        <w:t>When any Color Space mode is active, two global sliders appear that shift the entire selected gamut as a whole. These are not per-primary adjustments — they apply equally across the full colour space.</w:t>
       </w:r>
     </w:p>
     <w:tbl>
@@ -5487,13 +5487,13 @@
                 <w:color w:val="FFFFFF"/>
                 <w:sz w:val="18"/>
               </w:rPr>
-              <w:t>COLOR SELECT</w:t>
+              <w:t>SLIDER</w:t>
             </w:r>
           </w:p>
         </w:tc>
         <w:tc>
           <w:tcPr>
-            <w:tcW w:type="dxa" w:w="3024"/>
+            <w:tcW w:type="dxa" w:w="3456"/>
             <w:shd w:val="clear" w:color="auto" w:fill="003B8E"/>
             <w:vAlign w:val="center"/>
             <w:tcBorders>
@@ -5511,13 +5511,13 @@
                 <w:color w:val="FFFFFF"/>
                 <w:sz w:val="18"/>
               </w:rPr>
-              <w:t>SLIDER 1</w:t>
+              <w:t>DIRECTION</w:t>
             </w:r>
           </w:p>
         </w:tc>
         <w:tc>
           <w:tcPr>
-            <w:tcW w:type="dxa" w:w="3888"/>
+            <w:tcW w:type="dxa" w:w="3456"/>
             <w:shd w:val="clear" w:color="auto" w:fill="003B8E"/>
             <w:vAlign w:val="center"/>
             <w:tcBorders>
@@ -5535,7 +5535,7 @@
                 <w:color w:val="FFFFFF"/>
                 <w:sz w:val="18"/>
               </w:rPr>
-              <w:t>SLIDER 2</w:t>
+              <w:t>EFFECT</w:t>
             </w:r>
           </w:p>
         </w:tc>
@@ -5561,13 +5561,13 @@
                 <w:color w:val="1A1A1A"/>
                 <w:sz w:val="19"/>
               </w:rPr>
-              <w:t>Red</w:t>
+              <w:t>Cyan – Red</w:t>
             </w:r>
           </w:p>
         </w:tc>
         <w:tc>
           <w:tcPr>
-            <w:tcW w:type="dxa" w:w="3024"/>
+            <w:tcW w:type="dxa" w:w="3456"/>
             <w:shd w:val="clear" w:color="auto" w:fill="FFFFFF"/>
             <w:vAlign w:val="center"/>
             <w:tcBorders>
@@ -5584,13 +5584,13 @@
                 <w:color w:val="444444"/>
                 <w:sz w:val="19"/>
               </w:rPr>
-              <w:t>Cyan – Red</w:t>
+              <w:t>Negative → Cyan  |  Positive → Red</w:t>
             </w:r>
           </w:p>
         </w:tc>
         <w:tc>
           <w:tcPr>
-            <w:tcW w:type="dxa" w:w="3888"/>
+            <w:tcW w:type="dxa" w:w="3456"/>
             <w:shd w:val="clear" w:color="auto" w:fill="FFFFFF"/>
             <w:vAlign w:val="center"/>
             <w:tcBorders>
@@ -5607,7 +5607,7 @@
                 <w:color w:val="444444"/>
                 <w:sz w:val="19"/>
               </w:rPr>
-              <w:t>Magenta – Green</w:t>
+              <w:t>Shifts the entire gamut along the cyan–red opponent axis</w:t>
             </w:r>
           </w:p>
         </w:tc>
@@ -5633,13 +5633,13 @@
                 <w:color w:val="1A1A1A"/>
                 <w:sz w:val="19"/>
               </w:rPr>
-              <w:t>Green</w:t>
+              <w:t>Magenta – Green</w:t>
             </w:r>
           </w:p>
         </w:tc>
         <w:tc>
           <w:tcPr>
-            <w:tcW w:type="dxa" w:w="3024"/>
+            <w:tcW w:type="dxa" w:w="3456"/>
             <w:shd w:val="clear" w:color="auto" w:fill="F7F9FF"/>
             <w:vAlign w:val="center"/>
             <w:tcBorders>
@@ -5656,13 +5656,13 @@
                 <w:color w:val="444444"/>
                 <w:sz w:val="19"/>
               </w:rPr>
-              <w:t>Cyan – Red</w:t>
+              <w:t>Negative → Magenta  |  Positive → Green</w:t>
             </w:r>
           </w:p>
         </w:tc>
         <w:tc>
           <w:tcPr>
-            <w:tcW w:type="dxa" w:w="3888"/>
+            <w:tcW w:type="dxa" w:w="3456"/>
             <w:shd w:val="clear" w:color="auto" w:fill="F7F9FF"/>
             <w:vAlign w:val="center"/>
             <w:tcBorders>
@@ -5679,295 +5679,7 @@
                 <w:color w:val="444444"/>
                 <w:sz w:val="19"/>
               </w:rPr>
-              <w:t>Magenta – Green</w:t>
-            </w:r>
-          </w:p>
-        </w:tc>
-      </w:tr>
-      <w:tr>
-        <w:tc>
-          <w:tcPr>
-            <w:tcW w:type="dxa" w:w="2304"/>
-            <w:shd w:val="clear" w:color="auto" w:fill="FFFFFF"/>
-            <w:vAlign w:val="center"/>
-            <w:tcBorders>
-              <w:bottom w:val="single" w:sz="2" w:space="0" w:color="E0E0E0"/>
-            </w:tcBorders>
-          </w:tcPr>
-          <w:p>
-            <w:pPr>
-              <w:spacing w:before="60" w:after="60"/>
-            </w:pPr>
-            <w:r>
-              <w:rPr>
-                <w:rFonts w:ascii="Calibri" w:hAnsi="Calibri"/>
-                <w:b/>
-                <w:color w:val="1A1A1A"/>
-                <w:sz w:val="19"/>
-              </w:rPr>
-              <w:t>Blue</w:t>
-            </w:r>
-          </w:p>
-        </w:tc>
-        <w:tc>
-          <w:tcPr>
-            <w:tcW w:type="dxa" w:w="3024"/>
-            <w:shd w:val="clear" w:color="auto" w:fill="FFFFFF"/>
-            <w:vAlign w:val="center"/>
-            <w:tcBorders>
-              <w:bottom w:val="single" w:sz="2" w:space="0" w:color="E0E0E0"/>
-            </w:tcBorders>
-          </w:tcPr>
-          <w:p>
-            <w:pPr>
-              <w:spacing w:before="60" w:after="60"/>
-            </w:pPr>
-            <w:r>
-              <w:rPr>
-                <w:rFonts w:ascii="Calibri" w:hAnsi="Calibri"/>
-                <w:color w:val="444444"/>
-                <w:sz w:val="19"/>
-              </w:rPr>
-              <w:t>Cyan – Red</w:t>
-            </w:r>
-          </w:p>
-        </w:tc>
-        <w:tc>
-          <w:tcPr>
-            <w:tcW w:type="dxa" w:w="3888"/>
-            <w:shd w:val="clear" w:color="auto" w:fill="FFFFFF"/>
-            <w:vAlign w:val="center"/>
-            <w:tcBorders>
-              <w:bottom w:val="single" w:sz="2" w:space="0" w:color="E0E0E0"/>
-            </w:tcBorders>
-          </w:tcPr>
-          <w:p>
-            <w:pPr>
-              <w:spacing w:before="60" w:after="60"/>
-            </w:pPr>
-            <w:r>
-              <w:rPr>
-                <w:rFonts w:ascii="Calibri" w:hAnsi="Calibri"/>
-                <w:color w:val="444444"/>
-                <w:sz w:val="19"/>
-              </w:rPr>
-              <w:t>Magenta – Green</w:t>
-            </w:r>
-          </w:p>
-        </w:tc>
-      </w:tr>
-      <w:tr>
-        <w:tc>
-          <w:tcPr>
-            <w:tcW w:type="dxa" w:w="2304"/>
-            <w:shd w:val="clear" w:color="auto" w:fill="F7F9FF"/>
-            <w:vAlign w:val="center"/>
-            <w:tcBorders>
-              <w:bottom w:val="single" w:sz="2" w:space="0" w:color="E0E0E0"/>
-            </w:tcBorders>
-          </w:tcPr>
-          <w:p>
-            <w:pPr>
-              <w:spacing w:before="60" w:after="60"/>
-            </w:pPr>
-            <w:r>
-              <w:rPr>
-                <w:rFonts w:ascii="Calibri" w:hAnsi="Calibri"/>
-                <w:b/>
-                <w:color w:val="1A1A1A"/>
-                <w:sz w:val="19"/>
-              </w:rPr>
-              <w:t>Cyan</w:t>
-            </w:r>
-          </w:p>
-        </w:tc>
-        <w:tc>
-          <w:tcPr>
-            <w:tcW w:type="dxa" w:w="3024"/>
-            <w:shd w:val="clear" w:color="auto" w:fill="F7F9FF"/>
-            <w:vAlign w:val="center"/>
-            <w:tcBorders>
-              <w:bottom w:val="single" w:sz="2" w:space="0" w:color="E0E0E0"/>
-            </w:tcBorders>
-          </w:tcPr>
-          <w:p>
-            <w:pPr>
-              <w:spacing w:before="60" w:after="60"/>
-            </w:pPr>
-            <w:r>
-              <w:rPr>
-                <w:rFonts w:ascii="Calibri" w:hAnsi="Calibri"/>
-                <w:color w:val="444444"/>
-                <w:sz w:val="19"/>
-              </w:rPr>
-              <w:t>Cyan – Red</w:t>
-            </w:r>
-          </w:p>
-        </w:tc>
-        <w:tc>
-          <w:tcPr>
-            <w:tcW w:type="dxa" w:w="3888"/>
-            <w:shd w:val="clear" w:color="auto" w:fill="F7F9FF"/>
-            <w:vAlign w:val="center"/>
-            <w:tcBorders>
-              <w:bottom w:val="single" w:sz="2" w:space="0" w:color="E0E0E0"/>
-            </w:tcBorders>
-          </w:tcPr>
-          <w:p>
-            <w:pPr>
-              <w:spacing w:before="60" w:after="60"/>
-            </w:pPr>
-            <w:r>
-              <w:rPr>
-                <w:rFonts w:ascii="Calibri" w:hAnsi="Calibri"/>
-                <w:color w:val="444444"/>
-                <w:sz w:val="19"/>
-              </w:rPr>
-              <w:t>Magenta – Green</w:t>
-            </w:r>
-          </w:p>
-        </w:tc>
-      </w:tr>
-      <w:tr>
-        <w:tc>
-          <w:tcPr>
-            <w:tcW w:type="dxa" w:w="2304"/>
-            <w:shd w:val="clear" w:color="auto" w:fill="FFFFFF"/>
-            <w:vAlign w:val="center"/>
-            <w:tcBorders>
-              <w:bottom w:val="single" w:sz="2" w:space="0" w:color="E0E0E0"/>
-            </w:tcBorders>
-          </w:tcPr>
-          <w:p>
-            <w:pPr>
-              <w:spacing w:before="60" w:after="60"/>
-            </w:pPr>
-            <w:r>
-              <w:rPr>
-                <w:rFonts w:ascii="Calibri" w:hAnsi="Calibri"/>
-                <w:b/>
-                <w:color w:val="1A1A1A"/>
-                <w:sz w:val="19"/>
-              </w:rPr>
-              <w:t>Magenta</w:t>
-            </w:r>
-          </w:p>
-        </w:tc>
-        <w:tc>
-          <w:tcPr>
-            <w:tcW w:type="dxa" w:w="3024"/>
-            <w:shd w:val="clear" w:color="auto" w:fill="FFFFFF"/>
-            <w:vAlign w:val="center"/>
-            <w:tcBorders>
-              <w:bottom w:val="single" w:sz="2" w:space="0" w:color="E0E0E0"/>
-            </w:tcBorders>
-          </w:tcPr>
-          <w:p>
-            <w:pPr>
-              <w:spacing w:before="60" w:after="60"/>
-            </w:pPr>
-            <w:r>
-              <w:rPr>
-                <w:rFonts w:ascii="Calibri" w:hAnsi="Calibri"/>
-                <w:color w:val="444444"/>
-                <w:sz w:val="19"/>
-              </w:rPr>
-              <w:t>Cyan – Red</w:t>
-            </w:r>
-          </w:p>
-        </w:tc>
-        <w:tc>
-          <w:tcPr>
-            <w:tcW w:type="dxa" w:w="3888"/>
-            <w:shd w:val="clear" w:color="auto" w:fill="FFFFFF"/>
-            <w:vAlign w:val="center"/>
-            <w:tcBorders>
-              <w:bottom w:val="single" w:sz="2" w:space="0" w:color="E0E0E0"/>
-            </w:tcBorders>
-          </w:tcPr>
-          <w:p>
-            <w:pPr>
-              <w:spacing w:before="60" w:after="60"/>
-            </w:pPr>
-            <w:r>
-              <w:rPr>
-                <w:rFonts w:ascii="Calibri" w:hAnsi="Calibri"/>
-                <w:color w:val="444444"/>
-                <w:sz w:val="19"/>
-              </w:rPr>
-              <w:t>Magenta – Green</w:t>
-            </w:r>
-          </w:p>
-        </w:tc>
-      </w:tr>
-      <w:tr>
-        <w:tc>
-          <w:tcPr>
-            <w:tcW w:type="dxa" w:w="2304"/>
-            <w:shd w:val="clear" w:color="auto" w:fill="F7F9FF"/>
-            <w:vAlign w:val="center"/>
-            <w:tcBorders>
-              <w:bottom w:val="single" w:sz="2" w:space="0" w:color="E0E0E0"/>
-            </w:tcBorders>
-          </w:tcPr>
-          <w:p>
-            <w:pPr>
-              <w:spacing w:before="60" w:after="60"/>
-            </w:pPr>
-            <w:r>
-              <w:rPr>
-                <w:rFonts w:ascii="Calibri" w:hAnsi="Calibri"/>
-                <w:b/>
-                <w:color w:val="1A1A1A"/>
-                <w:sz w:val="19"/>
-              </w:rPr>
-              <w:t>Yellow</w:t>
-            </w:r>
-          </w:p>
-        </w:tc>
-        <w:tc>
-          <w:tcPr>
-            <w:tcW w:type="dxa" w:w="3024"/>
-            <w:shd w:val="clear" w:color="auto" w:fill="F7F9FF"/>
-            <w:vAlign w:val="center"/>
-            <w:tcBorders>
-              <w:bottom w:val="single" w:sz="2" w:space="0" w:color="E0E0E0"/>
-            </w:tcBorders>
-          </w:tcPr>
-          <w:p>
-            <w:pPr>
-              <w:spacing w:before="60" w:after="60"/>
-            </w:pPr>
-            <w:r>
-              <w:rPr>
-                <w:rFonts w:ascii="Calibri" w:hAnsi="Calibri"/>
-                <w:color w:val="444444"/>
-                <w:sz w:val="19"/>
-              </w:rPr>
-              <w:t>Cyan – Red</w:t>
-            </w:r>
-          </w:p>
-        </w:tc>
-        <w:tc>
-          <w:tcPr>
-            <w:tcW w:type="dxa" w:w="3888"/>
-            <w:shd w:val="clear" w:color="auto" w:fill="F7F9FF"/>
-            <w:vAlign w:val="center"/>
-            <w:tcBorders>
-              <w:bottom w:val="single" w:sz="2" w:space="0" w:color="E0E0E0"/>
-            </w:tcBorders>
-          </w:tcPr>
-          <w:p>
-            <w:pPr>
-              <w:spacing w:before="60" w:after="60"/>
-            </w:pPr>
-            <w:r>
-              <w:rPr>
-                <w:rFonts w:ascii="Calibri" w:hAnsi="Calibri"/>
-                <w:color w:val="444444"/>
-                <w:sz w:val="19"/>
-              </w:rPr>
-              <w:t>Magenta – Green</w:t>
+              <w:t>Shifts the entire gamut along the magenta–green opponent axis</w:t>
             </w:r>
           </w:p>
         </w:tc>
@@ -5984,7 +5696,7 @@
           <w:color w:val="777777"/>
           <w:sz w:val="17"/>
         </w:rPr>
-        <w:t>Note: Cyan–Red moves the selected colour toward cyan (negative) or red (positive). Magenta–Green moves it toward magenta (negative) or green (positive). Together these two axes allow 2D chromaticity positioning of each colour.</w:t>
+        <w:t>Note: These 2 sliders are present for all Color Space modes (BT.709, BT.2020, Color Space 1–3, Custom). They function as a global gamut white-point trim, not individual primary/secondary colour adjustments.</w:t>
       </w:r>
     </w:p>
     <w:p>
@@ -6014,7 +5726,7 @@
           <w:color w:val="444444"/>
           <w:sz w:val="19"/>
         </w:rPr>
-        <w:t>6 colour axes × 2 sliders = 12 individual chromaticity adjustments in Custom Color Space. Verified from projector on-screen display (screenshot). The manual only states "You can adjust the color space setting" without listing the sub-controls.</w:t>
+        <w:t>2 sliders total for the entire color space — confirmed from OSD screenshot. Earlier documentation suggesting per-primary adjustment (6 × 2 = 12) was incorrect.</w:t>
       </w:r>
     </w:p>
     <w:p>
@@ -7438,7 +7150,7 @@
                 <w:color w:val="1A1A1A"/>
                 <w:sz w:val="19"/>
               </w:rPr>
-              <w:t>Color Space Custom — chromaticity sliders</w:t>
+              <w:t>Color Space — global gamut sliders</w:t>
             </w:r>
           </w:p>
         </w:tc>
@@ -7461,7 +7173,7 @@
                 <w:color w:val="444444"/>
                 <w:sz w:val="19"/>
               </w:rPr>
-              <w:t>12</w:t>
+              <w:t>2</w:t>
             </w:r>
           </w:p>
         </w:tc>
@@ -7484,7 +7196,7 @@
                 <w:color w:val="444444"/>
                 <w:sz w:val="19"/>
               </w:rPr>
-              <w:t>6 colour axes × 2 sliders (Cyan–Red, Magenta–Green). Verified from OSD screenshot</w:t>
+              <w:t>Cyan–Red and Magenta–Green; apply to the entire selected color space, not per primary. Verified from OSD screenshot</w:t>
             </w:r>
           </w:p>
         </w:tc>

</xml_diff>